<commit_message>
feat(recursos): logo de Atribuya en el pack de plantillas
Portada con el logo horizontal (sustituye al wordmark de texto) y
encabezado con logo pequeño en todas las páginas interiores. Vista
previa de la página del recurso regenerada.

Co-Authored-By: Claude Fable 5 <noreply@anthropic.com>
</commit_message>
<xml_diff>
--- a/public/recursos/plantillas-respuesta-resenas-google.docx
+++ b/public/recursos/plantillas-respuesta-resenas-google.docx
@@ -4,19 +4,47 @@
   <w:body>
     <w:p>
       <w:pPr>
-        <w:spacing w:after="200" w:before="2200"/>
-      </w:pPr>
-      <w:r>
-        <w:rPr>
-          <w:rFonts w:ascii="Arial" w:cs="Arial" w:eastAsia="Arial" w:hAnsi="Arial"/>
-          <w:b/>
-          <w:bCs/>
-          <w:color w:val="A84A2A"/>
-          <w:spacing w:val="60"/>
-          <w:sz w:val="30"/>
-          <w:szCs w:val="30"/>
-        </w:rPr>
-        <w:t xml:space="preserve">ATRIBUYA</w:t>
+        <w:spacing w:after="260" w:before="2200"/>
+      </w:pPr>
+      <w:r>
+        <w:drawing>
+          <wp:inline distT="0" distB="0" distL="0" distR="0">
+            <wp:extent cx="1619250" cy="742950"/>
+            <wp:effectExtent t="0" r="0" b="0" l="0"/>
+            <wp:docPr id="1" name="logo-atribuya-portada" descr="Logotipo de Atribuya" title="Atribuya"/>
+            <wp:cNvGraphicFramePr>
+              <a:graphicFrameLocks xmlns:a="http://schemas.openxmlformats.org/drawingml/2006/main" noChangeAspect="1"/>
+            </wp:cNvGraphicFramePr>
+            <a:graphic xmlns:a="http://schemas.openxmlformats.org/drawingml/2006/main">
+              <a:graphicData uri="http://schemas.openxmlformats.org/drawingml/2006/picture">
+                <pic:pic xmlns:pic="http://schemas.openxmlformats.org/drawingml/2006/picture">
+                  <pic:nvPicPr>
+                    <pic:cNvPr id="0" name="" descr=""/>
+                    <pic:cNvPicPr>
+                      <a:picLocks noChangeAspect="1" noChangeArrowheads="1"/>
+                    </pic:cNvPicPr>
+                  </pic:nvPicPr>
+                  <pic:blipFill>
+                    <a:blip r:embed="rId11" cstate="none"/>
+                    <a:srcRect/>
+                    <a:stretch>
+                      <a:fillRect/>
+                    </a:stretch>
+                  </pic:blipFill>
+                  <pic:spPr bwMode="auto">
+                    <a:xfrm>
+                      <a:off x="0" y="0"/>
+                      <a:ext cx="1619250" cy="742950"/>
+                    </a:xfrm>
+                    <a:prstGeom prst="rect">
+                      <a:avLst/>
+                    </a:prstGeom>
+                  </pic:spPr>
+                </pic:pic>
+              </a:graphicData>
+            </a:graphic>
+          </wp:inline>
+        </w:drawing>
       </w:r>
     </w:p>
     <w:p>
@@ -2977,10 +3005,14 @@
       </w:r>
     </w:p>
     <w:sectPr>
-      <w:footerReference w:type="default" r:id="rId7"/>
+      <w:headerReference w:type="default" r:id="rId7"/>
+      <w:headerReference w:type="first" r:id="rId8"/>
+      <w:footerReference w:type="default" r:id="rId9"/>
+      <w:footerReference w:type="first" r:id="rId10"/>
       <w:pgSz w:w="11906" w:h="16838" w:orient="portrait"/>
       <w:pgMar w:top="1440" w:right="1440" w:bottom="1440" w:left="1440" w:header="708" w:footer="708" w:gutter="0"/>
       <w:pgNumType/>
+      <w:titlePg/>
       <w:docGrid w:linePitch="360"/>
     </w:sectPr>
   </w:body>
@@ -3071,6 +3103,49 @@
 </w:ftr>
 </file>
 
+<file path=word/footer2.xml><?xml version="1.0" encoding="utf-8"?>
+<w:ftr xmlns:wpc="http://schemas.microsoft.com/office/word/2010/wordprocessingCanvas" xmlns:mc="http://schemas.openxmlformats.org/markup-compatibility/2006" xmlns:o="urn:schemas-microsoft-com:office:office" xmlns:r="http://schemas.openxmlformats.org/officeDocument/2006/relationships" xmlns:m="http://schemas.openxmlformats.org/officeDocument/2006/math" xmlns:v="urn:schemas-microsoft-com:vml" xmlns:wp14="http://schemas.microsoft.com/office/word/2010/wordprocessingDrawing" xmlns:wp="http://schemas.openxmlformats.org/drawingml/2006/wordprocessingDrawing" xmlns:w10="urn:schemas-microsoft-com:office:word" xmlns:w="http://schemas.openxmlformats.org/wordprocessingml/2006/main" xmlns:w14="http://schemas.microsoft.com/office/word/2010/wordml" xmlns:w15="http://schemas.microsoft.com/office/word/2012/wordml" xmlns:wpg="http://schemas.microsoft.com/office/word/2010/wordprocessingGroup" xmlns:wpi="http://schemas.microsoft.com/office/word/2010/wordprocessingInk" xmlns:wne="http://schemas.microsoft.com/office/word/2006/wordml" xmlns:wps="http://schemas.microsoft.com/office/word/2010/wordprocessingShape">
+  <w:p>
+    <w:pPr>
+      <w:pBdr>
+        <w:top w:val="single" w:color="E9E4D8" w:sz="4" w:space="6"/>
+      </w:pBdr>
+      <w:tabs>
+        <w:tab w:val="right" w:pos="9026"/>
+      </w:tabs>
+    </w:pPr>
+    <w:r>
+      <w:rPr>
+        <w:rFonts w:ascii="Arial" w:cs="Arial" w:eastAsia="Arial" w:hAnsi="Arial"/>
+        <w:color w:val="8A8478"/>
+        <w:sz w:val="18"/>
+        <w:szCs w:val="18"/>
+      </w:rPr>
+      <w:t xml:space="preserve">Atribuya · atribuya.com · alejandro@atribuya.com</w:t>
+    </w:r>
+    <w:r>
+      <w:rPr>
+        <w:rFonts w:ascii="Arial" w:cs="Arial" w:eastAsia="Arial" w:hAnsi="Arial"/>
+      </w:rPr>
+      <w:t xml:space="preserve">	</w:t>
+    </w:r>
+    <w:r>
+      <w:rPr>
+        <w:rFonts w:ascii="Arial" w:cs="Arial" w:eastAsia="Arial" w:hAnsi="Arial"/>
+        <w:color w:val="8A8478"/>
+        <w:sz w:val="18"/>
+        <w:szCs w:val="18"/>
+      </w:rPr>
+      <w:t xml:space="preserve">Página </w:t>
+      <w:fldChar w:fldCharType="begin"/>
+      <w:instrText xml:space="preserve">PAGE</w:instrText>
+      <w:fldChar w:fldCharType="separate"/>
+      <w:fldChar w:fldCharType="end"/>
+    </w:r>
+  </w:p>
+</w:ftr>
+</file>
+
 <file path=word/footnotes.xml><?xml version="1.0" encoding="utf-8"?>
 <w:footnotes xmlns:wpc="http://schemas.microsoft.com/office/word/2010/wordprocessingCanvas" xmlns:mc="http://schemas.openxmlformats.org/markup-compatibility/2006" xmlns:o="urn:schemas-microsoft-com:office:office" xmlns:r="http://schemas.openxmlformats.org/officeDocument/2006/relationships" xmlns:m="http://schemas.openxmlformats.org/officeDocument/2006/math" xmlns:v="urn:schemas-microsoft-com:vml" xmlns:wp14="http://schemas.microsoft.com/office/word/2010/wordprocessingDrawing" xmlns:wp="http://schemas.openxmlformats.org/drawingml/2006/wordprocessingDrawing" xmlns:w10="urn:schemas-microsoft-com:office:word" xmlns:w="http://schemas.openxmlformats.org/wordprocessingml/2006/main" xmlns:w14="http://schemas.microsoft.com/office/word/2010/wordml" xmlns:w15="http://schemas.microsoft.com/office/word/2012/wordml" xmlns:wpg="http://schemas.microsoft.com/office/word/2010/wordprocessingGroup" xmlns:wpi="http://schemas.microsoft.com/office/word/2010/wordprocessingInk" xmlns:wne="http://schemas.microsoft.com/office/word/2006/wordml" xmlns:wps="http://schemas.microsoft.com/office/word/2010/wordprocessingShape" mc:Ignorable="w14 w15 wp14">
   <w:footnote w:type="separator" w:id="-1">
@@ -3106,6 +3181,60 @@
     </w:p>
   </w:footnote>
 </w:footnotes>
+</file>
+
+<file path=word/header1.xml><?xml version="1.0" encoding="utf-8"?>
+<w:hdr xmlns:wpc="http://schemas.microsoft.com/office/word/2010/wordprocessingCanvas" xmlns:mc="http://schemas.openxmlformats.org/markup-compatibility/2006" xmlns:o="urn:schemas-microsoft-com:office:office" xmlns:r="http://schemas.openxmlformats.org/officeDocument/2006/relationships" xmlns:m="http://schemas.openxmlformats.org/officeDocument/2006/math" xmlns:v="urn:schemas-microsoft-com:vml" xmlns:wp14="http://schemas.microsoft.com/office/word/2010/wordprocessingDrawing" xmlns:wp="http://schemas.openxmlformats.org/drawingml/2006/wordprocessingDrawing" xmlns:w10="urn:schemas-microsoft-com:office:word" xmlns:w="http://schemas.openxmlformats.org/wordprocessingml/2006/main" xmlns:w14="http://schemas.microsoft.com/office/word/2010/wordml" xmlns:w15="http://schemas.microsoft.com/office/word/2012/wordml" xmlns:wpg="http://schemas.microsoft.com/office/word/2010/wordprocessingGroup" xmlns:wpi="http://schemas.microsoft.com/office/word/2010/wordprocessingInk" xmlns:wne="http://schemas.microsoft.com/office/word/2006/wordml" xmlns:wps="http://schemas.microsoft.com/office/word/2010/wordprocessingShape" xmlns:cx="http://schemas.microsoft.com/office/drawing/2014/chartex" xmlns:cx1="http://schemas.microsoft.com/office/drawing/2015/9/8/chartex" xmlns:cx2="http://schemas.microsoft.com/office/drawing/2015/10/21/chartex" xmlns:cx3="http://schemas.microsoft.com/office/drawing/2016/5/9/chartex" xmlns:cx4="http://schemas.microsoft.com/office/drawing/2016/5/10/chartex" xmlns:cx5="http://schemas.microsoft.com/office/drawing/2016/5/11/chartex" xmlns:cx6="http://schemas.microsoft.com/office/drawing/2016/5/12/chartex" xmlns:cx7="http://schemas.microsoft.com/office/drawing/2016/5/13/chartex" xmlns:cx8="http://schemas.microsoft.com/office/drawing/2016/5/14/chartex" xmlns:w16cid="http://schemas.microsoft.com/office/word/2016/wordml/cid" xmlns:w16se="http://schemas.microsoft.com/office/word/2015/wordml/symex">
+  <w:p>
+    <w:pPr>
+      <w:jc w:val="right"/>
+    </w:pPr>
+    <w:r>
+      <w:drawing>
+        <wp:inline distT="0" distB="0" distL="0" distR="0">
+          <wp:extent cx="495300" cy="228600"/>
+          <wp:effectExtent t="0" r="0" b="0" l="0"/>
+          <wp:docPr id="1" name="logo-atribuya" descr="Logotipo de Atribuya" title="Atribuya"/>
+          <wp:cNvGraphicFramePr>
+            <a:graphicFrameLocks xmlns:a="http://schemas.openxmlformats.org/drawingml/2006/main" noChangeAspect="1"/>
+          </wp:cNvGraphicFramePr>
+          <a:graphic xmlns:a="http://schemas.openxmlformats.org/drawingml/2006/main">
+            <a:graphicData uri="http://schemas.openxmlformats.org/drawingml/2006/picture">
+              <pic:pic xmlns:pic="http://schemas.openxmlformats.org/drawingml/2006/picture">
+                <pic:nvPicPr>
+                  <pic:cNvPr id="0" name="" descr=""/>
+                  <pic:cNvPicPr>
+                    <a:picLocks noChangeAspect="1" noChangeArrowheads="1"/>
+                  </pic:cNvPicPr>
+                </pic:nvPicPr>
+                <pic:blipFill>
+                  <a:blip r:embed="rId0" cstate="none"/>
+                  <a:srcRect/>
+                  <a:stretch>
+                    <a:fillRect/>
+                  </a:stretch>
+                </pic:blipFill>
+                <pic:spPr bwMode="auto">
+                  <a:xfrm>
+                    <a:off x="0" y="0"/>
+                    <a:ext cx="495300" cy="228600"/>
+                  </a:xfrm>
+                  <a:prstGeom prst="rect">
+                    <a:avLst/>
+                  </a:prstGeom>
+                </pic:spPr>
+              </pic:pic>
+            </a:graphicData>
+          </a:graphic>
+        </wp:inline>
+      </w:drawing>
+    </w:r>
+  </w:p>
+</w:hdr>
+</file>
+
+<file path=word/header2.xml><?xml version="1.0" encoding="utf-8"?>
+<w:hdr xmlns:wpc="http://schemas.microsoft.com/office/word/2010/wordprocessingCanvas" xmlns:mc="http://schemas.openxmlformats.org/markup-compatibility/2006" xmlns:o="urn:schemas-microsoft-com:office:office" xmlns:r="http://schemas.openxmlformats.org/officeDocument/2006/relationships" xmlns:m="http://schemas.openxmlformats.org/officeDocument/2006/math" xmlns:v="urn:schemas-microsoft-com:vml" xmlns:wp14="http://schemas.microsoft.com/office/word/2010/wordprocessingDrawing" xmlns:wp="http://schemas.openxmlformats.org/drawingml/2006/wordprocessingDrawing" xmlns:w10="urn:schemas-microsoft-com:office:word" xmlns:w="http://schemas.openxmlformats.org/wordprocessingml/2006/main" xmlns:w14="http://schemas.microsoft.com/office/word/2010/wordml" xmlns:w15="http://schemas.microsoft.com/office/word/2012/wordml" xmlns:wpg="http://schemas.microsoft.com/office/word/2010/wordprocessingGroup" xmlns:wpi="http://schemas.microsoft.com/office/word/2010/wordprocessingInk" xmlns:wne="http://schemas.microsoft.com/office/word/2006/wordml" xmlns:wps="http://schemas.microsoft.com/office/word/2010/wordprocessingShape" xmlns:cx="http://schemas.microsoft.com/office/drawing/2014/chartex" xmlns:cx1="http://schemas.microsoft.com/office/drawing/2015/9/8/chartex" xmlns:cx2="http://schemas.microsoft.com/office/drawing/2015/10/21/chartex" xmlns:cx3="http://schemas.microsoft.com/office/drawing/2016/5/9/chartex" xmlns:cx4="http://schemas.microsoft.com/office/drawing/2016/5/10/chartex" xmlns:cx5="http://schemas.microsoft.com/office/drawing/2016/5/11/chartex" xmlns:cx6="http://schemas.microsoft.com/office/drawing/2016/5/12/chartex" xmlns:cx7="http://schemas.microsoft.com/office/drawing/2016/5/13/chartex" xmlns:cx8="http://schemas.microsoft.com/office/drawing/2016/5/14/chartex" xmlns:w16cid="http://schemas.microsoft.com/office/word/2016/wordml/cid" xmlns:w16se="http://schemas.microsoft.com/office/word/2015/wordml/symex"/>
 </file>
 
 <file path=word/numbering.xml><?xml version="1.0" encoding="utf-8"?>

</xml_diff>